<commit_message>
Documentation update for rev 1.1
</commit_message>
<xml_diff>
--- a/Documentation/GW4301AManual.docx
+++ b/Documentation/GW4301AManual.docx
@@ -134,7 +134,15 @@
         <w:pStyle w:val="NoSpacing"/>
       </w:pPr>
       <w:r>
-        <w:t>The GW4301A RAM expansion card is small enough to fit into a "stumpy" sized C64 cartridge but provides 2 MB of geoRAM-compatible memory. Power consumption is minimized through the use of a single 16 megabit DRAM chip.</w:t>
+        <w:t xml:space="preserve">The GW4301A RAM expansion card is small enough to fit into a "stumpy" sized C64 cartridge but provides 2 MB of geoRAM-compatible memory. Power consumption is minimized through the use of a single </w:t>
+      </w:r>
+      <w:proofErr w:type="gramStart"/>
+      <w:r>
+        <w:t>16 megabit</w:t>
+      </w:r>
+      <w:proofErr w:type="gramEnd"/>
+      <w:r>
+        <w:t xml:space="preserve"> DRAM chip.</w:t>
       </w:r>
     </w:p>
     <w:p>
@@ -147,7 +155,15 @@
     </w:p>
     <w:p>
       <w:r>
-        <w:t>GW4301A's design is fully open-source. The schematics, board layouts, and CPLD firmware are all freely available for commercial and noncommercial use. To download the design files, visit the Garrett's Workshop GitHub pag</w:t>
+        <w:t xml:space="preserve">GW4301A's design is fully </w:t>
+      </w:r>
+      <w:proofErr w:type="gramStart"/>
+      <w:r>
+        <w:t>open-source</w:t>
+      </w:r>
+      <w:proofErr w:type="gramEnd"/>
+      <w:r>
+        <w:t>. The schematics, board layouts, and CPLD firmware are all freely available for commercial and noncommercial use. To download the design files, visit the Garrett's Workshop GitHub pag</w:t>
       </w:r>
       <w:r>
         <w:t>e:</w:t>
@@ -185,7 +201,15 @@
         <w:t xml:space="preserve"> </w:t>
       </w:r>
       <w:r>
-        <w:t xml:space="preserve">GW4301A is a geoRAM-type memory expansion cartridge. Other geoRAM-type cartridges include the original geoRAM and the modern NeoRAM. On the other hand, REU-compatible memory cards include the original Commodore 1750 and 1764 RAM Expansion Units. GW4301A is </w:t>
+        <w:t xml:space="preserve">GW4301A is a geoRAM-type memory expansion cartridge. Other geoRAM-type cartridges include the original geoRAM and the modern </w:t>
+      </w:r>
+      <w:proofErr w:type="spellStart"/>
+      <w:r>
+        <w:t>NeoRAM</w:t>
+      </w:r>
+      <w:proofErr w:type="spellEnd"/>
+      <w:r>
+        <w:t xml:space="preserve">. On the other hand, REU-compatible memory cards include the original Commodore 1750 and 1764 RAM Expansion Units. GW4301A is </w:t>
       </w:r>
       <w:r>
         <w:rPr>
@@ -195,7 +219,10 @@
         <w:t>not</w:t>
       </w:r>
       <w:r>
-        <w:t xml:space="preserve"> compatible with REU-type memory cartridges such as the Commodore 1750 and 1764.</w:t>
+        <w:t xml:space="preserve"> compatible with REU-type memory cartridges such as the Commodore 1750 and 1764</w:t>
+      </w:r>
+      <w:r>
+        <w:t>.</w:t>
       </w:r>
     </w:p>
     <w:p>
@@ -228,7 +255,15 @@
     </w:p>
     <w:p>
       <w:r>
-        <w:t xml:space="preserve">GEOS supports memory expansion using a geoRAM-type memory cartridge such as the GW4301A, but not out-of-the box. You must install a special driver on your GEOS boot disk in order to be able to use the GW4301A with GEOS. This process can be slightly complicated by the copy protection present on most original GEOS disks. </w:t>
+        <w:t xml:space="preserve">GEOS </w:t>
+      </w:r>
+      <w:proofErr w:type="gramStart"/>
+      <w:r>
+        <w:t>supports</w:t>
+      </w:r>
+      <w:proofErr w:type="gramEnd"/>
+      <w:r>
+        <w:t xml:space="preserve"> memory expansion using a geoRAM-type memory cartridge such as the GW4301A, but not out-of-the box. You must install a special driver on your GEOS boot disk in order to be able to use the GW4301A with GEOS. This process can be slightly complicated by the copy protection present on most original GEOS disks. </w:t>
       </w:r>
       <w:r>
         <w:t>T</w:t>
@@ -480,7 +515,19 @@
                   <w:rPr>
                     <w:rFonts w:ascii="Cambria Math" w:hAnsi="Cambria Math"/>
                   </w:rPr>
-                  <m:t xml:space="preserve">57.658 </m:t>
+                  <m:t>57.</m:t>
+                </m:r>
+                <m:r>
+                  <w:rPr>
+                    <w:rFonts w:ascii="Cambria Math" w:hAnsi="Cambria Math"/>
+                  </w:rPr>
+                  <m:t>912</m:t>
+                </m:r>
+                <m:r>
+                  <w:rPr>
+                    <w:rFonts w:ascii="Cambria Math" w:hAnsi="Cambria Math"/>
+                  </w:rPr>
+                  <m:t xml:space="preserve"> </m:t>
                 </m:r>
                 <m:r>
                   <m:rPr>
@@ -2865,6 +2912,36 @@
       <w:shd w:val="clear" w:color="auto" w:fill="E1DFDD"/>
     </w:rPr>
   </w:style>
+  <w:style w:type="paragraph" w:styleId="BalloonText">
+    <w:name w:val="Balloon Text"/>
+    <w:basedOn w:val="Normal"/>
+    <w:link w:val="BalloonTextChar"/>
+    <w:uiPriority w:val="99"/>
+    <w:semiHidden/>
+    <w:unhideWhenUsed/>
+    <w:rsid w:val="00A560CD"/>
+    <w:pPr>
+      <w:spacing w:after="0"/>
+    </w:pPr>
+    <w:rPr>
+      <w:rFonts w:ascii="Times New Roman" w:hAnsi="Times New Roman" w:cs="Times New Roman"/>
+      <w:sz w:val="18"/>
+      <w:szCs w:val="18"/>
+    </w:rPr>
+  </w:style>
+  <w:style w:type="character" w:customStyle="1" w:styleId="BalloonTextChar">
+    <w:name w:val="Balloon Text Char"/>
+    <w:basedOn w:val="DefaultParagraphFont"/>
+    <w:link w:val="BalloonText"/>
+    <w:uiPriority w:val="99"/>
+    <w:semiHidden/>
+    <w:rsid w:val="00A560CD"/>
+    <w:rPr>
+      <w:rFonts w:ascii="Times New Roman" w:hAnsi="Times New Roman" w:cs="Times New Roman"/>
+      <w:sz w:val="18"/>
+      <w:szCs w:val="18"/>
+    </w:rPr>
+  </w:style>
 </w:styles>
 </file>
 

</xml_diff>